<commit_message>
fix(repair): P4 T5 — demote A-03c in Repair_Module.docx (Advisor Ruling R1)
Repair_Module.docx changes (Ruling R1 · blocking-for-merge):
- T5R14 A-03 row: nav "ไปต่อ" A-03c -> "A-03 (state-c)"
  + หมายเหตุ: added note "state-c = manual-override ruling (C9 Dispute)"
- T8R3 A-05 row: nav "ไปต่อ" A-03c -> "A-03 (state-c)"
- T8R4 A-03c PRIMARY ROW: deleted (REPAIR-JOB-OVERRIDE)
- T11R4 Admin summary: removed A-03c from screen ID list
  ("A-02, A-03, A-03c, A-04, A-05, A-21" -> "A-02, A-03, A-04, A-05, A-21")

Sweep acceptance (post-fix):
- 0 primary A-03c rows
- 0 bare nav target "A-03c" (all qualified as "A-03 (state-c)")
- 9-col structure intact: T0-T10 all 9 cols (T11 = 2-col summary, by design)

Co-Authored-By: Claude Sonnet 4.6 <noreply@anthropic.com>
</commit_message>
<xml_diff>
--- a/docs/mockup/Repair_Module.docx
+++ b/docs/mockup/Repair_Module.docx
@@ -7035,9 +7035,10 @@
             <w:r>
               <w:rPr>
                 <w:rFonts w:ascii="Arial" w:hAnsi="Arial"/>
-                <w:sz w:val="16"/>
-              </w:rPr>
-              <w:t>A-03c</w:t>
+                <w:b w:val="0"/>
+                <w:sz w:val="16"/>
+              </w:rPr>
+              <w:t>A-03 (state-c)</w:t>
             </w:r>
           </w:p>
         </w:tc>
@@ -7080,9 +7081,10 @@
             <w:r>
               <w:rPr>
                 <w:rFonts w:ascii="Arial" w:hAnsi="Arial"/>
-                <w:sz w:val="16"/>
-              </w:rPr>
-              <w:t>—</w:t>
+                <w:b w:val="0"/>
+                <w:sz w:val="16"/>
+              </w:rPr>
+              <w:t>— | state-c = manual-override ruling (C9 Dispute)</w:t>
             </w:r>
           </w:p>
         </w:tc>
@@ -8651,9 +8653,10 @@
             <w:r>
               <w:rPr>
                 <w:rFonts w:ascii="Arial" w:hAnsi="Arial"/>
-                <w:sz w:val="16"/>
-              </w:rPr>
-              <w:t>A-03c</w:t>
+                <w:b w:val="0"/>
+                <w:sz w:val="16"/>
+              </w:rPr>
+              <w:t>A-03 (state-c)</w:t>
             </w:r>
           </w:p>
         </w:tc>
@@ -8710,143 +8713,6 @@
                 <w:sz w:val="16"/>
               </w:rPr>
               <w:t>[localhost:3000/disputes/[id]](http://localhost:3000/disputes/[id])</w:t>
-            </w:r>
-          </w:p>
-        </w:tc>
-      </w:tr>
-      <w:tr>
-        <w:tc>
-          <w:tcPr>
-            <w:tcW w:type="dxa" w:w="1020"/>
-            <w:shd w:val="clear" w:color="auto" w:fill="DCE6F1"/>
-          </w:tcPr>
-          <w:p>
-            <w:r>
-              <w:rPr>
-                <w:rFonts w:ascii="Arial" w:hAnsi="Arial"/>
-                <w:sz w:val="16"/>
-              </w:rPr>
-              <w:t>A-03c</w:t>
-            </w:r>
-          </w:p>
-        </w:tc>
-        <w:tc>
-          <w:tcPr>
-            <w:tcW w:type="dxa" w:w="2154"/>
-            <w:shd w:val="clear" w:color="auto" w:fill="DCE6F1"/>
-          </w:tcPr>
-          <w:p>
-            <w:r>
-              <w:rPr>
-                <w:rFonts w:ascii="Arial" w:hAnsi="Arial"/>
-                <w:sz w:val="16"/>
-              </w:rPr>
-              <w:t>REPAIR-JOB-OVERRIDE</w:t>
-            </w:r>
-          </w:p>
-        </w:tc>
-        <w:tc>
-          <w:tcPr>
-            <w:tcW w:type="dxa" w:w="1587"/>
-            <w:shd w:val="clear" w:color="auto" w:fill="DCE6F1"/>
-          </w:tcPr>
-          <w:p>
-            <w:r>
-              <w:rPr>
-                <w:rFonts w:ascii="Arial" w:hAnsi="Arial"/>
-                <w:sz w:val="16"/>
-              </w:rPr>
-              <w:t>A-05</w:t>
-            </w:r>
-          </w:p>
-        </w:tc>
-        <w:tc>
-          <w:tcPr>
-            <w:tcW w:type="dxa" w:w="2154"/>
-            <w:shd w:val="clear" w:color="auto" w:fill="DCE6F1"/>
-          </w:tcPr>
-          <w:p>
-            <w:r>
-              <w:rPr>
-                <w:rFonts w:ascii="Arial" w:hAnsi="Arial"/>
-                <w:sz w:val="16"/>
-              </w:rPr>
-              <w:t>manual-override ตัดสิน</w:t>
-            </w:r>
-          </w:p>
-        </w:tc>
-        <w:tc>
-          <w:tcPr>
-            <w:tcW w:type="dxa" w:w="1587"/>
-            <w:shd w:val="clear" w:color="auto" w:fill="DCE6F1"/>
-          </w:tcPr>
-          <w:p>
-            <w:r>
-              <w:rPr>
-                <w:rFonts w:ascii="Arial" w:hAnsi="Arial"/>
-                <w:sz w:val="16"/>
-              </w:rPr>
-              <w:t>—</w:t>
-            </w:r>
-          </w:p>
-        </w:tc>
-        <w:tc>
-          <w:tcPr>
-            <w:tcW w:type="dxa" w:w="1814"/>
-            <w:shd w:val="clear" w:color="auto" w:fill="DCE6F1"/>
-          </w:tcPr>
-          <w:p>
-            <w:r>
-              <w:rPr>
-                <w:rFonts w:ascii="Arial" w:hAnsi="Arial"/>
-                <w:sz w:val="16"/>
-              </w:rPr>
-              <w:t>WeeeU U-04</w:t>
-            </w:r>
-          </w:p>
-        </w:tc>
-        <w:tc>
-          <w:tcPr>
-            <w:tcW w:type="dxa" w:w="794"/>
-            <w:shd w:val="clear" w:color="auto" w:fill="DCE6F1"/>
-          </w:tcPr>
-          <w:p>
-            <w:r>
-              <w:rPr>
-                <w:rFonts w:ascii="Arial" w:hAnsi="Arial"/>
-                <w:sz w:val="16"/>
-              </w:rPr>
-              <w:t>C9</w:t>
-            </w:r>
-          </w:p>
-        </w:tc>
-        <w:tc>
-          <w:tcPr>
-            <w:tcW w:type="dxa" w:w="1928"/>
-            <w:shd w:val="clear" w:color="auto" w:fill="DCE6F1"/>
-          </w:tcPr>
-          <w:p>
-            <w:r>
-              <w:rPr>
-                <w:rFonts w:ascii="Arial" w:hAnsi="Arial"/>
-                <w:sz w:val="16"/>
-              </w:rPr>
-              <w:t>Admin ruling</w:t>
-            </w:r>
-          </w:p>
-        </w:tc>
-        <w:tc>
-          <w:tcPr>
-            <w:tcW w:type="dxa" w:w="1134"/>
-            <w:shd w:val="clear" w:color="auto" w:fill="DCE6F1"/>
-          </w:tcPr>
-          <w:p>
-            <w:r>
-              <w:rPr>
-                <w:rFonts w:ascii="Arial" w:hAnsi="Arial"/>
-                <w:sz w:val="16"/>
-              </w:rPr>
-              <w:t>[localhost:3000/repair/jobs/[id]/manual-override](http://localhost:3000/repair/jobs/[id]/manual-override)</w:t>
             </w:r>
           </w:p>
         </w:tc>
@@ -10190,9 +10056,10 @@
             <w:r>
               <w:rPr>
                 <w:rFonts w:ascii="Arial" w:hAnsi="Arial"/>
-                <w:sz w:val="16"/>
-              </w:rPr>
-              <w:t>A-02, A-03, A-03c, A-04, A-05, A-21</w:t>
+                <w:b w:val="0"/>
+                <w:sz w:val="16"/>
+              </w:rPr>
+              <w:t>A-02, A-03, A-04, A-05, A-21</w:t>
             </w:r>
           </w:p>
         </w:tc>

</xml_diff>